<commit_message>
Added new proyect and update CV
</commit_message>
<xml_diff>
--- a/cv/CV Walter Ramirez_EN.docx
+++ b/cv/CV Walter Ramirez_EN.docx
@@ -2,54 +2,218 @@
 <file path=word/document.xml><?xml version="1.0" encoding="utf-8"?>
 <w:document xmlns:wpc="http://schemas.microsoft.com/office/word/2010/wordprocessingCanvas" xmlns:cx="http://schemas.microsoft.com/office/drawing/2014/chartex" xmlns:cx1="http://schemas.microsoft.com/office/drawing/2015/9/8/chartex" xmlns:cx2="http://schemas.microsoft.com/office/drawing/2015/10/21/chartex" xmlns:cx3="http://schemas.microsoft.com/office/drawing/2016/5/9/chartex" xmlns:cx4="http://schemas.microsoft.com/office/drawing/2016/5/10/chartex" xmlns:cx5="http://schemas.microsoft.com/office/drawing/2016/5/11/chartex" xmlns:cx6="http://schemas.microsoft.com/office/drawing/2016/5/12/chartex" xmlns:cx7="http://schemas.microsoft.com/office/drawing/2016/5/13/chartex" xmlns:cx8="http://schemas.microsoft.com/office/drawing/2016/5/14/chartex" xmlns:mc="http://schemas.openxmlformats.org/markup-compatibility/2006" xmlns:aink="http://schemas.microsoft.com/office/drawing/2016/ink" xmlns:am3d="http://schemas.microsoft.com/office/drawing/2017/model3d" xmlns:o="urn:schemas-microsoft-com:office:office" xmlns:oel="http://schemas.microsoft.com/office/2019/extlst" xmlns:r="http://schemas.openxmlformats.org/officeDocument/2006/relationships" xmlns:m="http://schemas.openxmlformats.org/officeDocument/2006/math" xmlns:v="urn:schemas-microsoft-com:vml" xmlns:wp14="http://schemas.microsoft.com/office/word/2010/wordprocessingDrawing" xmlns:wp="http://schemas.openxmlformats.org/drawingml/2006/wordprocessingDrawing" xmlns:w10="urn:schemas-microsoft-com:office:word" xmlns:w="http://schemas.openxmlformats.org/wordprocessingml/2006/main" xmlns:w14="http://schemas.microsoft.com/office/word/2010/wordml" xmlns:w15="http://schemas.microsoft.com/office/word/2012/wordml" xmlns:w16cex="http://schemas.microsoft.com/office/word/2018/wordml/cex" xmlns:w16cid="http://schemas.microsoft.com/office/word/2016/wordml/cid" xmlns:w16="http://schemas.microsoft.com/office/word/2018/wordml" xmlns:w16du="http://schemas.microsoft.com/office/word/2023/wordml/word16du" xmlns:w16sdtdh="http://schemas.microsoft.com/office/word/2020/wordml/sdtdatahash" xmlns:w16sdtfl="http://schemas.microsoft.com/office/word/2024/wordml/sdtformatlock" xmlns:w16se="http://schemas.microsoft.com/office/word/2015/wordml/symex" xmlns:wpg="http://schemas.microsoft.com/office/word/2010/wordprocessingGroup" xmlns:wpi="http://schemas.microsoft.com/office/word/2010/wordprocessingInk" xmlns:wne="http://schemas.microsoft.com/office/word/2006/wordml" xmlns:wps="http://schemas.microsoft.com/office/word/2010/wordprocessingShape" mc:Ignorable="w14 w15 w16se w16cid w16 w16cex w16sdtdh w16sdtfl w16du wp14">
   <w:body>
-    <w:p>
-      <w:pPr>
-        <w:jc w:val="center"/>
-        <w:rPr>
-          <w:rFonts w:ascii="Arial" w:eastAsia="Arial" w:hAnsi="Arial" w:cs="Arial"/>
-          <w:color w:val="0F4761"/>
-          <w:sz w:val="28"/>
-        </w:rPr>
-      </w:pPr>
-      <w:r>
-        <w:rPr>
-          <w:rFonts w:ascii="Arial" w:eastAsia="Arial" w:hAnsi="Arial" w:cs="Arial"/>
-          <w:color w:val="0F4761"/>
-          <w:sz w:val="28"/>
-        </w:rPr>
-        <w:t xml:space="preserve">Walter </w:t>
-      </w:r>
-      <w:proofErr w:type="spellStart"/>
-      <w:r>
-        <w:rPr>
-          <w:rFonts w:ascii="Arial" w:eastAsia="Arial" w:hAnsi="Arial" w:cs="Arial"/>
-          <w:color w:val="0F4761"/>
-          <w:sz w:val="28"/>
-        </w:rPr>
-        <w:t>Edenilson</w:t>
-      </w:r>
-      <w:proofErr w:type="spellEnd"/>
-      <w:r>
-        <w:rPr>
-          <w:rFonts w:ascii="Arial" w:eastAsia="Arial" w:hAnsi="Arial" w:cs="Arial"/>
-          <w:color w:val="0F4761"/>
-          <w:sz w:val="28"/>
-        </w:rPr>
-        <w:t xml:space="preserve"> Ramirez Deras</w:t>
-      </w:r>
-    </w:p>
-    <w:p>
-      <w:pPr>
-        <w:jc w:val="center"/>
-      </w:pPr>
-      <w:r>
-        <w:rPr>
-          <w:rFonts w:ascii="Arial" w:eastAsia="Arial" w:hAnsi="Arial" w:cs="Arial"/>
-          <w:sz w:val="28"/>
-        </w:rPr>
-        <w:t>Software Developer</w:t>
-      </w:r>
-    </w:p>
+    <w:tbl>
+      <w:tblPr>
+        <w:tblStyle w:val="TableGrid"/>
+        <w:tblW w:w="0" w:type="auto"/>
+        <w:tblInd w:w="39" w:type="dxa"/>
+        <w:tblBorders>
+          <w:top w:val="none" w:sz="0" w:space="0" w:color="auto"/>
+          <w:left w:val="none" w:sz="0" w:space="0" w:color="auto"/>
+          <w:bottom w:val="none" w:sz="0" w:space="0" w:color="auto"/>
+          <w:right w:val="none" w:sz="0" w:space="0" w:color="auto"/>
+          <w:insideH w:val="none" w:sz="0" w:space="0" w:color="auto"/>
+          <w:insideV w:val="none" w:sz="0" w:space="0" w:color="auto"/>
+        </w:tblBorders>
+        <w:tblLook w:val="04A0" w:firstRow="1" w:lastRow="0" w:firstColumn="1" w:lastColumn="0" w:noHBand="0" w:noVBand="1"/>
+      </w:tblPr>
+      <w:tblGrid>
+        <w:gridCol w:w="4658"/>
+        <w:gridCol w:w="4658"/>
+      </w:tblGrid>
+      <w:tr>
+        <w:tc>
+          <w:tcPr>
+            <w:tcW w:w="4658" w:type="dxa"/>
+          </w:tcPr>
+          <w:p>
+            <w:pPr>
+              <w:jc w:val="center"/>
+              <w:rPr>
+                <w:rFonts w:ascii="Arial" w:hAnsi="Arial" w:cs="Arial"/>
+                <w:szCs w:val="22"/>
+                <w:lang w:val="es-419"/>
+              </w:rPr>
+            </w:pPr>
+            <w:r>
+              <w:rPr>
+                <w:rFonts w:ascii="Arial" w:hAnsi="Arial" w:cs="Arial"/>
+                <w:noProof/>
+                <w:szCs w:val="22"/>
+                <w:lang w:val="es-419"/>
+              </w:rPr>
+              <w:drawing>
+                <wp:inline distT="0" distB="0" distL="0" distR="0" wp14:anchorId="6597ACC5" wp14:editId="06CBED18">
+                  <wp:extent cx="1466621" cy="2009773"/>
+                  <wp:effectExtent l="0" t="0" r="635" b="0"/>
+                  <wp:docPr id="2097728762" name="Picture 7"/>
+                  <wp:cNvGraphicFramePr>
+                    <a:graphicFrameLocks xmlns:a="http://schemas.openxmlformats.org/drawingml/2006/main" noChangeAspect="1"/>
+                  </wp:cNvGraphicFramePr>
+                  <a:graphic xmlns:a="http://schemas.openxmlformats.org/drawingml/2006/main">
+                    <a:graphicData uri="http://schemas.openxmlformats.org/drawingml/2006/picture">
+                      <pic:pic xmlns:pic="http://schemas.openxmlformats.org/drawingml/2006/picture">
+                        <pic:nvPicPr>
+                          <pic:cNvPr id="2097728762" name="Picture 2097728762"/>
+                          <pic:cNvPicPr/>
+                        </pic:nvPicPr>
+                        <pic:blipFill>
+                          <a:blip r:embed="rId5" cstate="print">
+                            <a:extLst>
+                              <a:ext uri="{28A0092B-C50C-407E-A947-70E740481C1C}">
+                                <a14:useLocalDpi xmlns:a14="http://schemas.microsoft.com/office/drawing/2010/main" val="0"/>
+                              </a:ext>
+                            </a:extLst>
+                          </a:blip>
+                          <a:stretch>
+                            <a:fillRect/>
+                          </a:stretch>
+                        </pic:blipFill>
+                        <pic:spPr>
+                          <a:xfrm>
+                            <a:off x="0" y="0"/>
+                            <a:ext cx="1488023" cy="2039101"/>
+                          </a:xfrm>
+                          <a:prstGeom prst="rect">
+                            <a:avLst/>
+                          </a:prstGeom>
+                        </pic:spPr>
+                      </pic:pic>
+                    </a:graphicData>
+                  </a:graphic>
+                </wp:inline>
+              </w:drawing>
+            </w:r>
+          </w:p>
+        </w:tc>
+        <w:tc>
+          <w:tcPr>
+            <w:tcW w:w="4658" w:type="dxa"/>
+          </w:tcPr>
+          <w:p>
+            <w:pPr>
+              <w:spacing w:after="16"/>
+              <w:ind w:left="30"/>
+              <w:jc w:val="center"/>
+              <w:rPr>
+                <w:rFonts w:ascii="Arial" w:hAnsi="Arial" w:cs="Arial"/>
+                <w:color w:val="0F4761"/>
+                <w:szCs w:val="22"/>
+                <w:lang w:val="es-419"/>
+              </w:rPr>
+            </w:pPr>
+          </w:p>
+          <w:p>
+            <w:pPr>
+              <w:spacing w:after="16"/>
+              <w:ind w:left="30"/>
+              <w:jc w:val="center"/>
+              <w:rPr>
+                <w:rFonts w:ascii="Arial" w:hAnsi="Arial" w:cs="Arial"/>
+                <w:color w:val="0F4761"/>
+                <w:szCs w:val="22"/>
+                <w:lang w:val="es-419"/>
+              </w:rPr>
+            </w:pPr>
+          </w:p>
+          <w:p>
+            <w:pPr>
+              <w:spacing w:after="16"/>
+              <w:ind w:left="30"/>
+              <w:jc w:val="center"/>
+              <w:rPr>
+                <w:rFonts w:ascii="Arial" w:hAnsi="Arial" w:cs="Arial"/>
+                <w:color w:val="0F4761"/>
+                <w:szCs w:val="22"/>
+                <w:lang w:val="es-419"/>
+              </w:rPr>
+            </w:pPr>
+          </w:p>
+          <w:p>
+            <w:pPr>
+              <w:spacing w:after="16"/>
+              <w:ind w:left="30"/>
+              <w:jc w:val="center"/>
+              <w:rPr>
+                <w:rFonts w:ascii="Arial" w:hAnsi="Arial" w:cs="Arial"/>
+                <w:color w:val="0F4761"/>
+                <w:szCs w:val="22"/>
+                <w:lang w:val="es-419"/>
+              </w:rPr>
+            </w:pPr>
+          </w:p>
+          <w:p>
+            <w:pPr>
+              <w:spacing w:after="16"/>
+              <w:ind w:left="30"/>
+              <w:jc w:val="center"/>
+              <w:rPr>
+                <w:rFonts w:ascii="Arial" w:hAnsi="Arial" w:cs="Arial"/>
+                <w:sz w:val="28"/>
+                <w:szCs w:val="28"/>
+              </w:rPr>
+            </w:pPr>
+            <w:r>
+              <w:rPr>
+                <w:rFonts w:ascii="Arial" w:hAnsi="Arial" w:cs="Arial"/>
+                <w:color w:val="0F4761"/>
+                <w:sz w:val="28"/>
+                <w:szCs w:val="28"/>
+              </w:rPr>
+              <w:t xml:space="preserve">Walter </w:t>
+            </w:r>
+            <w:proofErr w:type="spellStart"/>
+            <w:r>
+              <w:rPr>
+                <w:rFonts w:ascii="Arial" w:hAnsi="Arial" w:cs="Arial"/>
+                <w:color w:val="0F4761"/>
+                <w:sz w:val="28"/>
+                <w:szCs w:val="28"/>
+              </w:rPr>
+              <w:t>Edenilson</w:t>
+            </w:r>
+            <w:proofErr w:type="spellEnd"/>
+            <w:r>
+              <w:rPr>
+                <w:rFonts w:ascii="Arial" w:hAnsi="Arial" w:cs="Arial"/>
+                <w:color w:val="0F4761"/>
+                <w:sz w:val="28"/>
+                <w:szCs w:val="28"/>
+              </w:rPr>
+              <w:t xml:space="preserve"> Ramirez Deras</w:t>
+            </w:r>
+          </w:p>
+          <w:p>
+            <w:pPr>
+              <w:ind w:left="39"/>
+              <w:jc w:val="center"/>
+              <w:rPr>
+                <w:rFonts w:ascii="Arial" w:hAnsi="Arial" w:cs="Arial"/>
+                <w:sz w:val="28"/>
+                <w:szCs w:val="28"/>
+              </w:rPr>
+            </w:pPr>
+            <w:r>
+              <w:rPr>
+                <w:rFonts w:ascii="Arial" w:hAnsi="Arial" w:cs="Arial"/>
+                <w:sz w:val="28"/>
+                <w:szCs w:val="28"/>
+              </w:rPr>
+              <w:t xml:space="preserve">Software Developer </w:t>
+            </w:r>
+          </w:p>
+          <w:p>
+            <w:pPr>
+              <w:jc w:val="center"/>
+              <w:rPr>
+                <w:rFonts w:ascii="Arial" w:hAnsi="Arial" w:cs="Arial"/>
+                <w:szCs w:val="22"/>
+              </w:rPr>
+            </w:pPr>
+          </w:p>
+        </w:tc>
+      </w:tr>
+    </w:tbl>
     <w:p>
       <w:pPr>
         <w:spacing w:after="224"/>
@@ -64,15 +228,13 @@
           <w:lang w:val="es-419"/>
         </w:rPr>
       </w:pPr>
-      <w:proofErr w:type="spellStart"/>
       <w:r>
         <w:rPr>
           <w:rFonts w:ascii="Arial" w:eastAsia="Arial" w:hAnsi="Arial" w:cs="Arial"/>
           <w:lang w:val="es-419"/>
         </w:rPr>
-        <w:t>Jayaque</w:t>
-      </w:r>
-      <w:proofErr w:type="spellEnd"/>
+        <w:t>Santa Tecla</w:t>
+      </w:r>
       <w:r>
         <w:rPr>
           <w:rFonts w:ascii="Arial" w:eastAsia="Arial" w:hAnsi="Arial" w:cs="Arial"/>
@@ -342,6 +504,7 @@
         <w:ind w:left="86"/>
       </w:pPr>
       <w:r>
+        <w:lastRenderedPageBreak/>
         <w:t xml:space="preserve">Professional Experience   </w:t>
       </w:r>
     </w:p>
@@ -457,7 +620,6 @@
         <w:rPr>
           <w:rFonts w:ascii="Arial" w:eastAsia="Arial" w:hAnsi="Arial" w:cs="Arial"/>
         </w:rPr>
-        <w:lastRenderedPageBreak/>
         <w:t xml:space="preserve">Implemented authentication modules and user roles to ensure the integrity of sensitive business information. </w:t>
       </w:r>
     </w:p>
@@ -479,8 +641,175 @@
     </w:p>
     <w:p>
       <w:pPr>
+        <w:spacing w:after="271" w:line="249" w:lineRule="auto"/>
+        <w:ind w:right="34"/>
+        <w:rPr>
+          <w:rFonts w:ascii="Arial" w:hAnsi="Arial" w:cs="Arial"/>
+        </w:rPr>
+      </w:pPr>
+      <w:r>
+        <w:rPr>
+          <w:rFonts w:ascii="Arial" w:hAnsi="Arial" w:cs="Arial"/>
+        </w:rPr>
+        <w:t>Customer Service Representative | TELUS Digital</w:t>
+      </w:r>
+    </w:p>
+    <w:p>
+      <w:pPr>
+        <w:spacing w:after="271" w:line="249" w:lineRule="auto"/>
+        <w:ind w:right="34"/>
+        <w:rPr>
+          <w:rFonts w:ascii="Arial" w:hAnsi="Arial" w:cs="Arial"/>
+        </w:rPr>
+      </w:pPr>
+      <w:r>
+        <w:rPr>
+          <w:rFonts w:ascii="Arial" w:hAnsi="Arial" w:cs="Arial"/>
+        </w:rPr>
+        <w:t>February 2026 – Present</w:t>
+      </w:r>
+    </w:p>
+    <w:p>
+      <w:pPr>
+        <w:numPr>
+          <w:ilvl w:val="0"/>
+          <w:numId w:val="4"/>
+        </w:numPr>
+        <w:spacing w:after="271" w:line="249" w:lineRule="auto"/>
+        <w:ind w:right="34"/>
+        <w:rPr>
+          <w:rFonts w:ascii="Arial" w:hAnsi="Arial" w:cs="Arial"/>
+        </w:rPr>
+      </w:pPr>
+      <w:r>
+        <w:rPr>
+          <w:rFonts w:ascii="Arial" w:hAnsi="Arial" w:cs="Arial"/>
+        </w:rPr>
+        <w:t xml:space="preserve">Provided customer support for banking-related products and services through inbound calls. </w:t>
+      </w:r>
+    </w:p>
+    <w:p>
+      <w:pPr>
+        <w:numPr>
+          <w:ilvl w:val="0"/>
+          <w:numId w:val="4"/>
+        </w:numPr>
+        <w:spacing w:after="271" w:line="249" w:lineRule="auto"/>
+        <w:ind w:right="34"/>
+        <w:rPr>
+          <w:rFonts w:ascii="Arial" w:hAnsi="Arial" w:cs="Arial"/>
+        </w:rPr>
+      </w:pPr>
+      <w:r>
+        <w:rPr>
+          <w:rFonts w:ascii="Arial" w:hAnsi="Arial" w:cs="Arial"/>
+        </w:rPr>
+        <w:t xml:space="preserve">Verified customer information while following security and compliance procedures. </w:t>
+      </w:r>
+    </w:p>
+    <w:p>
+      <w:pPr>
+        <w:numPr>
+          <w:ilvl w:val="0"/>
+          <w:numId w:val="4"/>
+        </w:numPr>
+        <w:spacing w:after="271" w:line="249" w:lineRule="auto"/>
+        <w:ind w:right="34"/>
+        <w:rPr>
+          <w:rFonts w:ascii="Arial" w:hAnsi="Arial" w:cs="Arial"/>
+        </w:rPr>
+      </w:pPr>
+      <w:r>
+        <w:rPr>
+          <w:rFonts w:ascii="Arial" w:hAnsi="Arial" w:cs="Arial"/>
+        </w:rPr>
+        <w:t xml:space="preserve">Resolved account-related inquiries and guided customers through service processes. </w:t>
+      </w:r>
+    </w:p>
+    <w:p>
+      <w:pPr>
+        <w:numPr>
+          <w:ilvl w:val="0"/>
+          <w:numId w:val="4"/>
+        </w:numPr>
+        <w:spacing w:after="271" w:line="249" w:lineRule="auto"/>
+        <w:ind w:right="34"/>
+        <w:rPr>
+          <w:rFonts w:ascii="Arial" w:hAnsi="Arial" w:cs="Arial"/>
+        </w:rPr>
+      </w:pPr>
+      <w:r>
+        <w:rPr>
+          <w:rFonts w:ascii="Arial" w:hAnsi="Arial" w:cs="Arial"/>
+        </w:rPr>
+        <w:t xml:space="preserve">Maintained high standards of customer satisfaction through professional communication and problem-solving. </w:t>
+      </w:r>
+    </w:p>
+    <w:p>
+      <w:pPr>
+        <w:numPr>
+          <w:ilvl w:val="0"/>
+          <w:numId w:val="4"/>
+        </w:numPr>
+        <w:spacing w:after="271" w:line="249" w:lineRule="auto"/>
+        <w:ind w:right="34"/>
+        <w:rPr>
+          <w:rFonts w:ascii="Arial" w:hAnsi="Arial" w:cs="Arial"/>
+        </w:rPr>
+      </w:pPr>
+      <w:r>
+        <w:rPr>
+          <w:rFonts w:ascii="Arial" w:hAnsi="Arial" w:cs="Arial"/>
+        </w:rPr>
+        <w:t>Managed multiple systems and tools simultaneously while documenting customer interactions accurately.</w:t>
+      </w:r>
+    </w:p>
+    <w:p>
+      <w:pPr>
+        <w:spacing w:after="271" w:line="249" w:lineRule="auto"/>
+        <w:ind w:right="34"/>
+      </w:pPr>
+    </w:p>
+    <w:p>
+      <w:pPr>
         <w:spacing w:after="278"/>
         <w:ind w:left="826"/>
+        <w:rPr>
+          <w:rFonts w:ascii="Arial" w:eastAsia="Arial" w:hAnsi="Arial" w:cs="Arial"/>
+        </w:rPr>
+      </w:pPr>
+    </w:p>
+    <w:p>
+      <w:pPr>
+        <w:spacing w:after="278"/>
+        <w:ind w:left="826"/>
+        <w:rPr>
+          <w:rFonts w:ascii="Arial" w:eastAsia="Arial" w:hAnsi="Arial" w:cs="Arial"/>
+        </w:rPr>
+      </w:pPr>
+    </w:p>
+    <w:p>
+      <w:pPr>
+        <w:spacing w:after="278"/>
+        <w:ind w:left="826"/>
+        <w:rPr>
+          <w:rFonts w:ascii="Arial" w:eastAsia="Arial" w:hAnsi="Arial" w:cs="Arial"/>
+        </w:rPr>
+      </w:pPr>
+    </w:p>
+    <w:p>
+      <w:pPr>
+        <w:spacing w:after="278"/>
+        <w:ind w:left="826"/>
+        <w:rPr>
+          <w:rFonts w:ascii="Arial" w:eastAsia="Arial" w:hAnsi="Arial" w:cs="Arial"/>
+        </w:rPr>
+      </w:pPr>
+    </w:p>
+    <w:p>
+      <w:pPr>
+        <w:spacing w:after="278"/>
+        <w:ind w:left="826"/>
       </w:pPr>
       <w:r>
         <w:rPr>
@@ -495,6 +824,7 @@
         <w:ind w:left="86"/>
       </w:pPr>
       <w:r>
+        <w:lastRenderedPageBreak/>
         <w:t xml:space="preserve">Featured Projects   </w:t>
       </w:r>
     </w:p>
@@ -721,6 +1051,155 @@
 <file path=word/numbering.xml><?xml version="1.0" encoding="utf-8"?>
 <w:numbering xmlns:wpc="http://schemas.microsoft.com/office/word/2010/wordprocessingCanvas" xmlns:cx="http://schemas.microsoft.com/office/drawing/2014/chartex" xmlns:cx1="http://schemas.microsoft.com/office/drawing/2015/9/8/chartex" xmlns:cx2="http://schemas.microsoft.com/office/drawing/2015/10/21/chartex" xmlns:cx3="http://schemas.microsoft.com/office/drawing/2016/5/9/chartex" xmlns:cx4="http://schemas.microsoft.com/office/drawing/2016/5/10/chartex" xmlns:cx5="http://schemas.microsoft.com/office/drawing/2016/5/11/chartex" xmlns:cx6="http://schemas.microsoft.com/office/drawing/2016/5/12/chartex" xmlns:cx7="http://schemas.microsoft.com/office/drawing/2016/5/13/chartex" xmlns:cx8="http://schemas.microsoft.com/office/drawing/2016/5/14/chartex" xmlns:mc="http://schemas.openxmlformats.org/markup-compatibility/2006" xmlns:aink="http://schemas.microsoft.com/office/drawing/2016/ink" xmlns:am3d="http://schemas.microsoft.com/office/drawing/2017/model3d" xmlns:o="urn:schemas-microsoft-com:office:office" xmlns:oel="http://schemas.microsoft.com/office/2019/extlst" xmlns:r="http://schemas.openxmlformats.org/officeDocument/2006/relationships" xmlns:m="http://schemas.openxmlformats.org/officeDocument/2006/math" xmlns:v="urn:schemas-microsoft-com:vml" xmlns:wp14="http://schemas.microsoft.com/office/word/2010/wordprocessingDrawing" xmlns:wp="http://schemas.openxmlformats.org/drawingml/2006/wordprocessingDrawing" xmlns:w10="urn:schemas-microsoft-com:office:word" xmlns:w="http://schemas.openxmlformats.org/wordprocessingml/2006/main" xmlns:w14="http://schemas.microsoft.com/office/word/2010/wordml" xmlns:w15="http://schemas.microsoft.com/office/word/2012/wordml" xmlns:w16cex="http://schemas.microsoft.com/office/word/2018/wordml/cex" xmlns:w16cid="http://schemas.microsoft.com/office/word/2016/wordml/cid" xmlns:w16="http://schemas.microsoft.com/office/word/2018/wordml" xmlns:w16du="http://schemas.microsoft.com/office/word/2023/wordml/word16du" xmlns:w16sdtdh="http://schemas.microsoft.com/office/word/2020/wordml/sdtdatahash" xmlns:w16sdtfl="http://schemas.microsoft.com/office/word/2024/wordml/sdtformatlock" xmlns:w16se="http://schemas.microsoft.com/office/word/2015/wordml/symex" xmlns:wpg="http://schemas.microsoft.com/office/word/2010/wordprocessingGroup" xmlns:wpi="http://schemas.microsoft.com/office/word/2010/wordprocessingInk" xmlns:wne="http://schemas.microsoft.com/office/word/2006/wordml" xmlns:wps="http://schemas.microsoft.com/office/word/2010/wordprocessingShape" mc:Ignorable="w14 w15 w16se w16cid w16 w16cex w16sdtdh w16sdtfl w16du wp14">
   <w:abstractNum w:abstractNumId="0" w15:restartNumberingAfterBreak="0">
+    <w:nsid w:val="06FE6A11"/>
+    <w:multiLevelType w:val="multilevel"/>
+    <w:tmpl w:val="D22C5B1E"/>
+    <w:lvl w:ilvl="0">
+      <w:start w:val="1"/>
+      <w:numFmt w:val="bullet"/>
+      <w:lvlText w:val=""/>
+      <w:lvlJc w:val="left"/>
+      <w:pPr>
+        <w:tabs>
+          <w:tab w:val="num" w:pos="720"/>
+        </w:tabs>
+        <w:ind w:left="720" w:hanging="360"/>
+      </w:pPr>
+      <w:rPr>
+        <w:rFonts w:ascii="Symbol" w:hAnsi="Symbol" w:hint="default"/>
+        <w:sz w:val="20"/>
+      </w:rPr>
+    </w:lvl>
+    <w:lvl w:ilvl="1" w:tentative="1">
+      <w:start w:val="1"/>
+      <w:numFmt w:val="bullet"/>
+      <w:lvlText w:val="o"/>
+      <w:lvlJc w:val="left"/>
+      <w:pPr>
+        <w:tabs>
+          <w:tab w:val="num" w:pos="1440"/>
+        </w:tabs>
+        <w:ind w:left="1440" w:hanging="360"/>
+      </w:pPr>
+      <w:rPr>
+        <w:rFonts w:ascii="Courier New" w:hAnsi="Courier New" w:hint="default"/>
+        <w:sz w:val="20"/>
+      </w:rPr>
+    </w:lvl>
+    <w:lvl w:ilvl="2" w:tentative="1">
+      <w:start w:val="1"/>
+      <w:numFmt w:val="bullet"/>
+      <w:lvlText w:val=""/>
+      <w:lvlJc w:val="left"/>
+      <w:pPr>
+        <w:tabs>
+          <w:tab w:val="num" w:pos="2160"/>
+        </w:tabs>
+        <w:ind w:left="2160" w:hanging="360"/>
+      </w:pPr>
+      <w:rPr>
+        <w:rFonts w:ascii="Wingdings" w:hAnsi="Wingdings" w:hint="default"/>
+        <w:sz w:val="20"/>
+      </w:rPr>
+    </w:lvl>
+    <w:lvl w:ilvl="3" w:tentative="1">
+      <w:start w:val="1"/>
+      <w:numFmt w:val="bullet"/>
+      <w:lvlText w:val=""/>
+      <w:lvlJc w:val="left"/>
+      <w:pPr>
+        <w:tabs>
+          <w:tab w:val="num" w:pos="2880"/>
+        </w:tabs>
+        <w:ind w:left="2880" w:hanging="360"/>
+      </w:pPr>
+      <w:rPr>
+        <w:rFonts w:ascii="Wingdings" w:hAnsi="Wingdings" w:hint="default"/>
+        <w:sz w:val="20"/>
+      </w:rPr>
+    </w:lvl>
+    <w:lvl w:ilvl="4" w:tentative="1">
+      <w:start w:val="1"/>
+      <w:numFmt w:val="bullet"/>
+      <w:lvlText w:val=""/>
+      <w:lvlJc w:val="left"/>
+      <w:pPr>
+        <w:tabs>
+          <w:tab w:val="num" w:pos="3600"/>
+        </w:tabs>
+        <w:ind w:left="3600" w:hanging="360"/>
+      </w:pPr>
+      <w:rPr>
+        <w:rFonts w:ascii="Wingdings" w:hAnsi="Wingdings" w:hint="default"/>
+        <w:sz w:val="20"/>
+      </w:rPr>
+    </w:lvl>
+    <w:lvl w:ilvl="5" w:tentative="1">
+      <w:start w:val="1"/>
+      <w:numFmt w:val="bullet"/>
+      <w:lvlText w:val=""/>
+      <w:lvlJc w:val="left"/>
+      <w:pPr>
+        <w:tabs>
+          <w:tab w:val="num" w:pos="4320"/>
+        </w:tabs>
+        <w:ind w:left="4320" w:hanging="360"/>
+      </w:pPr>
+      <w:rPr>
+        <w:rFonts w:ascii="Wingdings" w:hAnsi="Wingdings" w:hint="default"/>
+        <w:sz w:val="20"/>
+      </w:rPr>
+    </w:lvl>
+    <w:lvl w:ilvl="6" w:tentative="1">
+      <w:start w:val="1"/>
+      <w:numFmt w:val="bullet"/>
+      <w:lvlText w:val=""/>
+      <w:lvlJc w:val="left"/>
+      <w:pPr>
+        <w:tabs>
+          <w:tab w:val="num" w:pos="5040"/>
+        </w:tabs>
+        <w:ind w:left="5040" w:hanging="360"/>
+      </w:pPr>
+      <w:rPr>
+        <w:rFonts w:ascii="Wingdings" w:hAnsi="Wingdings" w:hint="default"/>
+        <w:sz w:val="20"/>
+      </w:rPr>
+    </w:lvl>
+    <w:lvl w:ilvl="7" w:tentative="1">
+      <w:start w:val="1"/>
+      <w:numFmt w:val="bullet"/>
+      <w:lvlText w:val=""/>
+      <w:lvlJc w:val="left"/>
+      <w:pPr>
+        <w:tabs>
+          <w:tab w:val="num" w:pos="5760"/>
+        </w:tabs>
+        <w:ind w:left="5760" w:hanging="360"/>
+      </w:pPr>
+      <w:rPr>
+        <w:rFonts w:ascii="Wingdings" w:hAnsi="Wingdings" w:hint="default"/>
+        <w:sz w:val="20"/>
+      </w:rPr>
+    </w:lvl>
+    <w:lvl w:ilvl="8" w:tentative="1">
+      <w:start w:val="1"/>
+      <w:numFmt w:val="bullet"/>
+      <w:lvlText w:val=""/>
+      <w:lvlJc w:val="left"/>
+      <w:pPr>
+        <w:tabs>
+          <w:tab w:val="num" w:pos="6480"/>
+        </w:tabs>
+        <w:ind w:left="6480" w:hanging="360"/>
+      </w:pPr>
+      <w:rPr>
+        <w:rFonts w:ascii="Wingdings" w:hAnsi="Wingdings" w:hint="default"/>
+        <w:sz w:val="20"/>
+      </w:rPr>
+    </w:lvl>
+  </w:abstractNum>
+  <w:abstractNum w:abstractNumId="1" w15:restartNumberingAfterBreak="0">
     <w:nsid w:val="0D4137CB"/>
     <w:multiLevelType w:val="hybridMultilevel"/>
     <w:tmpl w:val="319231E0"/>
@@ -932,7 +1411,7 @@
       </w:rPr>
     </w:lvl>
   </w:abstractNum>
-  <w:abstractNum w:abstractNumId="1" w15:restartNumberingAfterBreak="0">
+  <w:abstractNum w:abstractNumId="2" w15:restartNumberingAfterBreak="0">
     <w:nsid w:val="23E8444C"/>
     <w:multiLevelType w:val="hybridMultilevel"/>
     <w:tmpl w:val="2BDAAF9E"/>
@@ -1144,7 +1623,7 @@
       </w:rPr>
     </w:lvl>
   </w:abstractNum>
-  <w:abstractNum w:abstractNumId="2" w15:restartNumberingAfterBreak="0">
+  <w:abstractNum w:abstractNumId="3" w15:restartNumberingAfterBreak="0">
     <w:nsid w:val="4A6536DA"/>
     <w:multiLevelType w:val="hybridMultilevel"/>
     <w:tmpl w:val="05364F54"/>
@@ -1357,12 +1836,15 @@
     </w:lvl>
   </w:abstractNum>
   <w:num w:numId="1" w16cid:durableId="1240794144">
+    <w:abstractNumId w:val="2"/>
+  </w:num>
+  <w:num w:numId="2" w16cid:durableId="557975328">
+    <w:abstractNumId w:val="3"/>
+  </w:num>
+  <w:num w:numId="3" w16cid:durableId="1871989567">
     <w:abstractNumId w:val="1"/>
   </w:num>
-  <w:num w:numId="2" w16cid:durableId="557975328">
-    <w:abstractNumId w:val="2"/>
-  </w:num>
-  <w:num w:numId="3" w16cid:durableId="1871989567">
+  <w:num w:numId="4" w16cid:durableId="81340226">
     <w:abstractNumId w:val="0"/>
   </w:num>
 </w:numbering>
@@ -1796,10 +2278,32 @@
       <w:color w:val="0F4761"/>
     </w:rPr>
   </w:style>
+  <w:style w:type="paragraph" w:styleId="Heading2">
+    <w:name w:val="heading 2"/>
+    <w:basedOn w:val="Normal"/>
+    <w:next w:val="Normal"/>
+    <w:link w:val="Heading2Char"/>
+    <w:uiPriority w:val="9"/>
+    <w:semiHidden/>
+    <w:unhideWhenUsed/>
+    <w:qFormat/>
+    <w:rsid w:val="00F23548"/>
+    <w:pPr>
+      <w:keepNext/>
+      <w:keepLines/>
+      <w:spacing w:before="40" w:after="0"/>
+      <w:outlineLvl w:val="1"/>
+    </w:pPr>
+    <w:rPr>
+      <w:rFonts w:asciiTheme="majorHAnsi" w:eastAsiaTheme="majorEastAsia" w:hAnsiTheme="majorHAnsi" w:cstheme="majorBidi"/>
+      <w:color w:val="0F4761" w:themeColor="accent1" w:themeShade="BF"/>
+      <w:sz w:val="26"/>
+      <w:szCs w:val="26"/>
+    </w:rPr>
+  </w:style>
   <w:style w:type="character" w:default="1" w:styleId="DefaultParagraphFont">
     <w:name w:val="Default Paragraph Font"/>
     <w:uiPriority w:val="1"/>
-    <w:semiHidden/>
     <w:unhideWhenUsed/>
   </w:style>
   <w:style w:type="table" w:default="1" w:styleId="TableNormal">
@@ -1831,6 +2335,39 @@
       <w:b/>
       <w:color w:val="0F4761"/>
       <w:sz w:val="24"/>
+    </w:rPr>
+  </w:style>
+  <w:style w:type="table" w:styleId="TableGrid">
+    <w:name w:val="Table Grid"/>
+    <w:basedOn w:val="TableNormal"/>
+    <w:uiPriority w:val="39"/>
+    <w:rsid w:val="00822B80"/>
+    <w:pPr>
+      <w:spacing w:after="0" w:line="240" w:lineRule="auto"/>
+    </w:pPr>
+    <w:tblPr>
+      <w:tblBorders>
+        <w:top w:val="single" w:sz="4" w:space="0" w:color="auto"/>
+        <w:left w:val="single" w:sz="4" w:space="0" w:color="auto"/>
+        <w:bottom w:val="single" w:sz="4" w:space="0" w:color="auto"/>
+        <w:right w:val="single" w:sz="4" w:space="0" w:color="auto"/>
+        <w:insideH w:val="single" w:sz="4" w:space="0" w:color="auto"/>
+        <w:insideV w:val="single" w:sz="4" w:space="0" w:color="auto"/>
+      </w:tblBorders>
+    </w:tblPr>
+  </w:style>
+  <w:style w:type="character" w:customStyle="1" w:styleId="Heading2Char">
+    <w:name w:val="Heading 2 Char"/>
+    <w:basedOn w:val="DefaultParagraphFont"/>
+    <w:link w:val="Heading2"/>
+    <w:uiPriority w:val="9"/>
+    <w:semiHidden/>
+    <w:rsid w:val="00F23548"/>
+    <w:rPr>
+      <w:rFonts w:asciiTheme="majorHAnsi" w:eastAsiaTheme="majorEastAsia" w:hAnsiTheme="majorHAnsi" w:cstheme="majorBidi"/>
+      <w:color w:val="0F4761" w:themeColor="accent1" w:themeShade="BF"/>
+      <w:sz w:val="26"/>
+      <w:szCs w:val="26"/>
     </w:rPr>
   </w:style>
 </w:styles>

</xml_diff>